<commit_message>
feat(contracts): โหลด PDF จาก .docx โดยตรง (Chromium + docx-preview) รันในตัว Vercel
เพิ่มปุ่ม "โหลด PDF" ทั้ง 4 ชนิดเอกสาร — PDF สร้างจากไฟล์ .docx ตัวเดียวกับปุ่ม
โหลด .docx → PDF จึงตรงกับ docx/ต้นฉบับ ไม่ต้องพึ่งบริการแปลงภายนอก

- app/api/contracts/[id]/pdf: render docx ผ่าน headless Chromium (@sparticuz/chromium
  สำหรับ serverless) + docx-preview + ฉีดฟอนต์ CordiaUPC ที่ฝังไว้ → page.pdf()
- lib/contract-docx-render.ts: แยก logic สร้าง docx buffer ใช้ร่วม docx+pdf route
- lib/pdf-assets: docx-preview.min.js + jszip.min.js (inject เข้า page ตอน render)
- prep_lib.strip_numbering: ลบ numPr ที่ค้างจาก Word ออกจากทุก template
  (กัน docx-preview โชว์เลข auto เกิน เช่น 0.1/0.2)
- regenerate templates ทั้ง 4, next.config trace assets/chromium เข้า bundle

Co-Authored-By: Claude Opus 4.8 (1M context) <noreply@anthropic.com>
Claude-Session: https://claude.ai/code/session_01Nh5n5DMmsoZqbEdoxKmZcx
</commit_message>
<xml_diff>
--- a/templates/creditor.docx
+++ b/templates/creditor.docx
@@ -4719,10 +4719,6 @@
     <w:p>
       <w:pPr>
         <w:pStyle w:val="ListParagraph"/>
-        <w:numPr>
-          <w:ilvl w:val="0"/>
-          <w:numId w:val="8"/>
-        </w:numPr>
         <w:rPr>
           <w:rFonts w:asciiTheme="minorBidi" w:hAnsiTheme="minorBidi"/>
           <w:szCs w:val="24"/>
@@ -4777,10 +4773,6 @@
     <w:p>
       <w:pPr>
         <w:pStyle w:val="ListParagraph"/>
-        <w:numPr>
-          <w:ilvl w:val="0"/>
-          <w:numId w:val="8"/>
-        </w:numPr>
         <w:rPr>
           <w:rFonts w:asciiTheme="minorBidi" w:hAnsiTheme="minorBidi"/>
           <w:szCs w:val="24"/>
@@ -4822,10 +4814,6 @@
     <w:p>
       <w:pPr>
         <w:pStyle w:val="ListParagraph"/>
-        <w:numPr>
-          <w:ilvl w:val="0"/>
-          <w:numId w:val="8"/>
-        </w:numPr>
         <w:rPr>
           <w:rFonts w:asciiTheme="minorBidi" w:hAnsiTheme="minorBidi"/>
           <w:szCs w:val="24"/>

</xml_diff>

<commit_message>
fix(pdf): externalize @sparticuz/chromium (Vercel) + เก็บโลโก้ MENA ใน creditor
- next.config serverExternalPackages: ["@sparticuz/chromium","puppeteer-core"]
  แก้ error บน Vercel "input directory .../@sparticuz/chromium/bin does not exist"
  (Next bundle ทำให้ path /bin ผิด — ต้องรันจาก node_modules)
- prep_creditor: drop_images=False เก็บโลโก้ MENA letterhead ไว้ (รูปอื่นในสัญญา
  ทั้งหมดเป็นของแนบ specimen: ใบจดทะเบียน/สมุดบัญชี/บัตรปชช. — ลบถูกแล้ว)

Co-Authored-By: Claude Opus 4.8 (1M context) <noreply@anthropic.com>
Claude-Session: https://claude.ai/code/session_01Nh5n5DMmsoZqbEdoxKmZcx
</commit_message>
<xml_diff>
--- a/templates/creditor.docx
+++ b/templates/creditor.docx
@@ -9,6 +9,41 @@
           <w:noProof/>
           <w:sz w:val="20"/>
         </w:rPr>
+        <w:drawing>
+          <wp:inline distT="0" distB="0" distL="0" distR="0" wp14:anchorId="0309F629" wp14:editId="34B2686C">
+            <wp:extent cx="5003632" cy="521207"/>
+            <wp:effectExtent l="0" t="0" r="0" b="0"/>
+            <wp:docPr id="1" name="Image 1"/>
+            <wp:cNvGraphicFramePr>
+              <a:graphicFrameLocks xmlns:a="http://schemas.openxmlformats.org/drawingml/2006/main"/>
+            </wp:cNvGraphicFramePr>
+            <a:graphic xmlns:a="http://schemas.openxmlformats.org/drawingml/2006/main">
+              <a:graphicData uri="http://schemas.openxmlformats.org/drawingml/2006/picture">
+                <pic:pic xmlns:pic="http://schemas.openxmlformats.org/drawingml/2006/picture">
+                  <pic:nvPicPr>
+                    <pic:cNvPr id="1" name="Image 1"/>
+                    <pic:cNvPicPr/>
+                  </pic:nvPicPr>
+                  <pic:blipFill>
+                    <a:blip r:embed="rId7" cstate="print"/>
+                    <a:stretch>
+                      <a:fillRect/>
+                    </a:stretch>
+                  </pic:blipFill>
+                  <pic:spPr>
+                    <a:xfrm>
+                      <a:off x="0" y="0"/>
+                      <a:ext cx="5003632" cy="521207"/>
+                    </a:xfrm>
+                    <a:prstGeom prst="rect">
+                      <a:avLst/>
+                    </a:prstGeom>
+                  </pic:spPr>
+                </pic:pic>
+              </a:graphicData>
+            </a:graphic>
+          </wp:inline>
+        </w:drawing>
       </w:r>
     </w:p>
     <w:p>
@@ -27,6 +62,67 @@
           <w:sz w:val="28"/>
           <w:szCs w:val="28"/>
         </w:rPr>
+        <mc:AlternateContent>
+          <mc:Choice Requires="wps">
+            <w:drawing>
+              <wp:anchor distT="0" distB="0" distL="114300" distR="114300" simplePos="0" relativeHeight="251659264" behindDoc="0" locked="0" layoutInCell="1" allowOverlap="1" wp14:anchorId="541013A8" wp14:editId="4466B552">
+                <wp:simplePos x="0" y="0"/>
+                <wp:positionH relativeFrom="column">
+                  <wp:posOffset>5429250</wp:posOffset>
+                </wp:positionH>
+                <wp:positionV relativeFrom="paragraph">
+                  <wp:posOffset>311150</wp:posOffset>
+                </wp:positionV>
+                <wp:extent cx="1009650" cy="238125"/>
+                <wp:effectExtent l="0" t="0" r="19050" b="28575"/>
+                <wp:wrapNone/>
+                <wp:docPr id="310895772" name="Rectangle 1"/>
+                <wp:cNvGraphicFramePr/>
+                <a:graphic xmlns:a="http://schemas.openxmlformats.org/drawingml/2006/main">
+                  <a:graphicData uri="http://schemas.microsoft.com/office/word/2010/wordprocessingShape">
+                    <wps:wsp>
+                      <wps:cNvSpPr/>
+                      <wps:spPr>
+                        <a:xfrm>
+                          <a:off x="0" y="0"/>
+                          <a:ext cx="1009650" cy="238125"/>
+                        </a:xfrm>
+                        <a:prstGeom prst="rect">
+                          <a:avLst/>
+                        </a:prstGeom>
+                      </wps:spPr>
+                      <wps:style>
+                        <a:lnRef idx="2">
+                          <a:schemeClr val="dk1"/>
+                        </a:lnRef>
+                        <a:fillRef idx="1">
+                          <a:schemeClr val="lt1"/>
+                        </a:fillRef>
+                        <a:effectRef idx="0">
+                          <a:schemeClr val="dk1"/>
+                        </a:effectRef>
+                        <a:fontRef idx="minor">
+                          <a:schemeClr val="dk1"/>
+                        </a:fontRef>
+                      </wps:style>
+                      <wps:bodyPr rot="0" spcFirstLastPara="0" vertOverflow="overflow" horzOverflow="overflow" vert="horz" wrap="square" lIns="91440" tIns="45720" rIns="91440" bIns="45720" numCol="1" spcCol="0" rtlCol="0" fromWordArt="0" anchor="ctr" anchorCtr="0" forceAA="0" compatLnSpc="1">
+                        <a:prstTxWarp prst="textNoShape">
+                          <a:avLst/>
+                        </a:prstTxWarp>
+                        <a:noAutofit/>
+                      </wps:bodyPr>
+                    </wps:wsp>
+                  </a:graphicData>
+                </a:graphic>
+              </wp:anchor>
+            </w:drawing>
+          </mc:Choice>
+          <mc:Fallback>
+            <w:pict>
+              <v:rect w14:anchorId="36996F86" id="Rectangle 1" o:spid="_x0000_s1026" style="position:absolute;margin-left:427.5pt;margin-top:24.5pt;width:79.5pt;height:18.75pt;z-index:251659264;visibility:visible;mso-wrap-style:square;mso-wrap-distance-left:9pt;mso-wrap-distance-top:0;mso-wrap-distance-right:9pt;mso-wrap-distance-bottom:0;mso-position-horizontal:absolute;mso-position-horizontal-relative:text;mso-position-vertical:absolute;mso-position-vertical-relative:text;v-text-anchor:middle" o:gfxdata="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" fillcolor="white [3201]" strokecolor="black [3200]" strokeweight="1pt"/>
+            </w:pict>
+          </mc:Fallback>
+        </mc:AlternateContent>
       </w:r>
       <w:r>
         <w:rPr>
@@ -35,6 +131,73 @@
           <w:sz w:val="28"/>
           <w:szCs w:val="28"/>
         </w:rPr>
+        <mc:AlternateContent>
+          <mc:Choice Requires="wps">
+            <w:drawing>
+              <wp:anchor distT="0" distB="0" distL="114300" distR="114300" simplePos="0" relativeHeight="251661312" behindDoc="0" locked="0" layoutInCell="1" allowOverlap="1" wp14:anchorId="571C9709" wp14:editId="4D8E336C">
+                <wp:simplePos x="0" y="0"/>
+                <wp:positionH relativeFrom="column">
+                  <wp:posOffset>5448300</wp:posOffset>
+                </wp:positionH>
+                <wp:positionV relativeFrom="paragraph">
+                  <wp:posOffset>10795</wp:posOffset>
+                </wp:positionV>
+                <wp:extent cx="1000125" cy="257175"/>
+                <wp:effectExtent l="0" t="0" r="28575" b="28575"/>
+                <wp:wrapNone/>
+                <wp:docPr id="1087068459" name="Rectangle 1"/>
+                <wp:cNvGraphicFramePr/>
+                <a:graphic xmlns:a="http://schemas.openxmlformats.org/drawingml/2006/main">
+                  <a:graphicData uri="http://schemas.microsoft.com/office/word/2010/wordprocessingShape">
+                    <wps:wsp>
+                      <wps:cNvSpPr/>
+                      <wps:spPr>
+                        <a:xfrm>
+                          <a:off x="0" y="0"/>
+                          <a:ext cx="1000125" cy="257175"/>
+                        </a:xfrm>
+                        <a:prstGeom prst="rect">
+                          <a:avLst/>
+                        </a:prstGeom>
+                      </wps:spPr>
+                      <wps:style>
+                        <a:lnRef idx="2">
+                          <a:schemeClr val="dk1"/>
+                        </a:lnRef>
+                        <a:fillRef idx="1">
+                          <a:schemeClr val="lt1"/>
+                        </a:fillRef>
+                        <a:effectRef idx="0">
+                          <a:schemeClr val="dk1"/>
+                        </a:effectRef>
+                        <a:fontRef idx="minor">
+                          <a:schemeClr val="dk1"/>
+                        </a:fontRef>
+                      </wps:style>
+                      <wps:bodyPr rot="0" spcFirstLastPara="0" vertOverflow="overflow" horzOverflow="overflow" vert="horz" wrap="square" lIns="91440" tIns="45720" rIns="91440" bIns="45720" numCol="1" spcCol="0" rtlCol="0" fromWordArt="0" anchor="ctr" anchorCtr="0" forceAA="0" compatLnSpc="1">
+                        <a:prstTxWarp prst="textNoShape">
+                          <a:avLst/>
+                        </a:prstTxWarp>
+                        <a:noAutofit/>
+                      </wps:bodyPr>
+                    </wps:wsp>
+                  </a:graphicData>
+                </a:graphic>
+                <wp14:sizeRelH relativeFrom="margin">
+                  <wp14:pctWidth>0</wp14:pctWidth>
+                </wp14:sizeRelH>
+                <wp14:sizeRelV relativeFrom="margin">
+                  <wp14:pctHeight>0</wp14:pctHeight>
+                </wp14:sizeRelV>
+              </wp:anchor>
+            </w:drawing>
+          </mc:Choice>
+          <mc:Fallback>
+            <w:pict>
+              <v:rect w14:anchorId="0426C73A" id="Rectangle 1" o:spid="_x0000_s1026" style="position:absolute;margin-left:429pt;margin-top:.85pt;width:78.75pt;height:20.25pt;z-index:251661312;visibility:visible;mso-wrap-style:square;mso-width-percent:0;mso-height-percent:0;mso-wrap-distance-left:9pt;mso-wrap-distance-top:0;mso-wrap-distance-right:9pt;mso-wrap-distance-bottom:0;mso-position-horizontal:absolute;mso-position-horizontal-relative:text;mso-position-vertical:absolute;mso-position-vertical-relative:text;mso-width-percent:0;mso-height-percent:0;mso-width-relative:margin;mso-height-relative:margin;v-text-anchor:middle" o:gfxdata="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" fillcolor="white [3201]" strokecolor="black [3200]" strokeweight="1pt"/>
+            </w:pict>
+          </mc:Fallback>
+        </mc:AlternateContent>
       </w:r>
       <w:r>
         <w:rPr>
@@ -382,6 +545,67 @@
           <w:szCs w:val="24"/>
           <w:lang w:val="th-TH"/>
         </w:rPr>
+        <mc:AlternateContent>
+          <mc:Choice Requires="wps">
+            <w:drawing>
+              <wp:anchor distT="0" distB="0" distL="114300" distR="114300" simplePos="0" relativeHeight="251666432" behindDoc="0" locked="0" layoutInCell="1" allowOverlap="1" wp14:anchorId="4C13E615" wp14:editId="6BD5D1F0">
+                <wp:simplePos x="0" y="0"/>
+                <wp:positionH relativeFrom="column">
+                  <wp:posOffset>2933700</wp:posOffset>
+                </wp:positionH>
+                <wp:positionV relativeFrom="paragraph">
+                  <wp:posOffset>7620</wp:posOffset>
+                </wp:positionV>
+                <wp:extent cx="552450" cy="266700"/>
+                <wp:effectExtent l="0" t="0" r="19050" b="19050"/>
+                <wp:wrapNone/>
+                <wp:docPr id="637674449" name="Rectangle 3"/>
+                <wp:cNvGraphicFramePr/>
+                <a:graphic xmlns:a="http://schemas.openxmlformats.org/drawingml/2006/main">
+                  <a:graphicData uri="http://schemas.microsoft.com/office/word/2010/wordprocessingShape">
+                    <wps:wsp>
+                      <wps:cNvSpPr/>
+                      <wps:spPr>
+                        <a:xfrm>
+                          <a:off x="0" y="0"/>
+                          <a:ext cx="552450" cy="266700"/>
+                        </a:xfrm>
+                        <a:prstGeom prst="rect">
+                          <a:avLst/>
+                        </a:prstGeom>
+                      </wps:spPr>
+                      <wps:style>
+                        <a:lnRef idx="2">
+                          <a:schemeClr val="dk1"/>
+                        </a:lnRef>
+                        <a:fillRef idx="1">
+                          <a:schemeClr val="lt1"/>
+                        </a:fillRef>
+                        <a:effectRef idx="0">
+                          <a:schemeClr val="dk1"/>
+                        </a:effectRef>
+                        <a:fontRef idx="minor">
+                          <a:schemeClr val="dk1"/>
+                        </a:fontRef>
+                      </wps:style>
+                      <wps:bodyPr rot="0" spcFirstLastPara="0" vertOverflow="overflow" horzOverflow="overflow" vert="horz" wrap="square" lIns="91440" tIns="45720" rIns="91440" bIns="45720" numCol="1" spcCol="0" rtlCol="0" fromWordArt="0" anchor="ctr" anchorCtr="0" forceAA="0" compatLnSpc="1">
+                        <a:prstTxWarp prst="textNoShape">
+                          <a:avLst/>
+                        </a:prstTxWarp>
+                        <a:noAutofit/>
+                      </wps:bodyPr>
+                    </wps:wsp>
+                  </a:graphicData>
+                </a:graphic>
+              </wp:anchor>
+            </w:drawing>
+          </mc:Choice>
+          <mc:Fallback>
+            <w:pict>
+              <v:rect w14:anchorId="0D69C30E" id="Rectangle 3" o:spid="_x0000_s1026" style="position:absolute;margin-left:231pt;margin-top:.6pt;width:43.5pt;height:21pt;z-index:251666432;visibility:visible;mso-wrap-style:square;mso-wrap-distance-left:9pt;mso-wrap-distance-top:0;mso-wrap-distance-right:9pt;mso-wrap-distance-bottom:0;mso-position-horizontal:absolute;mso-position-horizontal-relative:text;mso-position-vertical:absolute;mso-position-vertical-relative:text;v-text-anchor:middle" o:gfxdata="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" fillcolor="white [3201]" strokecolor="black [3200]" strokeweight="1pt"/>
+            </w:pict>
+          </mc:Fallback>
+        </mc:AlternateContent>
       </w:r>
       <w:r>
         <w:rPr>
@@ -389,6 +613,67 @@
           <w:szCs w:val="24"/>
           <w:lang w:val="th-TH"/>
         </w:rPr>
+        <mc:AlternateContent>
+          <mc:Choice Requires="wps">
+            <w:drawing>
+              <wp:anchor distT="0" distB="0" distL="114300" distR="114300" simplePos="0" relativeHeight="251662336" behindDoc="0" locked="0" layoutInCell="1" allowOverlap="1" wp14:anchorId="7932B3BC" wp14:editId="271FFB3B">
+                <wp:simplePos x="0" y="0"/>
+                <wp:positionH relativeFrom="column">
+                  <wp:posOffset>85725</wp:posOffset>
+                </wp:positionH>
+                <wp:positionV relativeFrom="paragraph">
+                  <wp:posOffset>7620</wp:posOffset>
+                </wp:positionV>
+                <wp:extent cx="552450" cy="266700"/>
+                <wp:effectExtent l="0" t="0" r="19050" b="19050"/>
+                <wp:wrapNone/>
+                <wp:docPr id="780968539" name="Rectangle 3"/>
+                <wp:cNvGraphicFramePr/>
+                <a:graphic xmlns:a="http://schemas.openxmlformats.org/drawingml/2006/main">
+                  <a:graphicData uri="http://schemas.microsoft.com/office/word/2010/wordprocessingShape">
+                    <wps:wsp>
+                      <wps:cNvSpPr/>
+                      <wps:spPr>
+                        <a:xfrm>
+                          <a:off x="0" y="0"/>
+                          <a:ext cx="552450" cy="266700"/>
+                        </a:xfrm>
+                        <a:prstGeom prst="rect">
+                          <a:avLst/>
+                        </a:prstGeom>
+                      </wps:spPr>
+                      <wps:style>
+                        <a:lnRef idx="2">
+                          <a:schemeClr val="dk1"/>
+                        </a:lnRef>
+                        <a:fillRef idx="1">
+                          <a:schemeClr val="lt1"/>
+                        </a:fillRef>
+                        <a:effectRef idx="0">
+                          <a:schemeClr val="dk1"/>
+                        </a:effectRef>
+                        <a:fontRef idx="minor">
+                          <a:schemeClr val="dk1"/>
+                        </a:fontRef>
+                      </wps:style>
+                      <wps:bodyPr rot="0" spcFirstLastPara="0" vertOverflow="overflow" horzOverflow="overflow" vert="horz" wrap="square" lIns="91440" tIns="45720" rIns="91440" bIns="45720" numCol="1" spcCol="0" rtlCol="0" fromWordArt="0" anchor="ctr" anchorCtr="0" forceAA="0" compatLnSpc="1">
+                        <a:prstTxWarp prst="textNoShape">
+                          <a:avLst/>
+                        </a:prstTxWarp>
+                        <a:noAutofit/>
+                      </wps:bodyPr>
+                    </wps:wsp>
+                  </a:graphicData>
+                </a:graphic>
+              </wp:anchor>
+            </w:drawing>
+          </mc:Choice>
+          <mc:Fallback>
+            <w:pict>
+              <v:rect w14:anchorId="3DDBBA1C" id="Rectangle 3" o:spid="_x0000_s1026" style="position:absolute;margin-left:6.75pt;margin-top:.6pt;width:43.5pt;height:21pt;z-index:251662336;visibility:visible;mso-wrap-style:square;mso-wrap-distance-left:9pt;mso-wrap-distance-top:0;mso-wrap-distance-right:9pt;mso-wrap-distance-bottom:0;mso-position-horizontal:absolute;mso-position-horizontal-relative:text;mso-position-vertical:absolute;mso-position-vertical-relative:text;v-text-anchor:middle" o:gfxdata="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" fillcolor="white [3201]" strokecolor="black [3200]" strokeweight="1pt"/>
+            </w:pict>
+          </mc:Fallback>
+        </mc:AlternateContent>
       </w:r>
       <w:r>
         <w:rPr>
@@ -469,6 +754,101 @@
           <w:szCs w:val="24"/>
           <w:lang w:val="th-TH"/>
         </w:rPr>
+        <mc:AlternateContent>
+          <mc:Choice Requires="wps">
+            <w:drawing>
+              <wp:anchor distT="0" distB="0" distL="114300" distR="114300" simplePos="0" relativeHeight="251668480" behindDoc="0" locked="0" layoutInCell="1" allowOverlap="1" wp14:anchorId="338A81D1" wp14:editId="684A97DF">
+                <wp:simplePos x="0" y="0"/>
+                <wp:positionH relativeFrom="page">
+                  <wp:posOffset>3375972</wp:posOffset>
+                </wp:positionH>
+                <wp:positionV relativeFrom="paragraph">
+                  <wp:posOffset>12065</wp:posOffset>
+                </wp:positionV>
+                <wp:extent cx="552450" cy="266700"/>
+                <wp:effectExtent l="0" t="0" r="19050" b="19050"/>
+                <wp:wrapNone/>
+                <wp:docPr id="383781880" name="Rectangle 3"/>
+                <wp:cNvGraphicFramePr/>
+                <a:graphic xmlns:a="http://schemas.openxmlformats.org/drawingml/2006/main">
+                  <a:graphicData uri="http://schemas.microsoft.com/office/word/2010/wordprocessingShape">
+                    <wps:wsp>
+                      <wps:cNvSpPr/>
+                      <wps:spPr>
+                        <a:xfrm>
+                          <a:off x="0" y="0"/>
+                          <a:ext cx="552450" cy="266700"/>
+                        </a:xfrm>
+                        <a:prstGeom prst="rect">
+                          <a:avLst/>
+                        </a:prstGeom>
+                      </wps:spPr>
+                      <wps:style>
+                        <a:lnRef idx="2">
+                          <a:schemeClr val="dk1"/>
+                        </a:lnRef>
+                        <a:fillRef idx="1">
+                          <a:schemeClr val="lt1"/>
+                        </a:fillRef>
+                        <a:effectRef idx="0">
+                          <a:schemeClr val="dk1"/>
+                        </a:effectRef>
+                        <a:fontRef idx="minor">
+                          <a:schemeClr val="dk1"/>
+                        </a:fontRef>
+                      </wps:style>
+                      <wps:txbx>
+                        <w:txbxContent>
+                          <w:p>
+                            <w:pPr>
+                              <w:jc w:val="center"/>
+                              <w:rPr>
+                                <w:rFonts w:hint="cs"/>
+                                <w:cs/>
+                              </w:rPr>
+                            </w:pPr>
+                            <w:r>
+                              <w:t>/</w:t>
+                            </w:r>
+                          </w:p>
+                        </w:txbxContent>
+                      </wps:txbx>
+                      <wps:bodyPr rot="0" spcFirstLastPara="0" vertOverflow="overflow" horzOverflow="overflow" vert="horz" wrap="square" lIns="91440" tIns="45720" rIns="91440" bIns="45720" numCol="1" spcCol="0" rtlCol="0" fromWordArt="0" anchor="ctr" anchorCtr="0" forceAA="0" compatLnSpc="1">
+                        <a:prstTxWarp prst="textNoShape">
+                          <a:avLst/>
+                        </a:prstTxWarp>
+                        <a:noAutofit/>
+                      </wps:bodyPr>
+                    </wps:wsp>
+                  </a:graphicData>
+                </a:graphic>
+              </wp:anchor>
+            </w:drawing>
+          </mc:Choice>
+          <mc:Fallback>
+            <w:pict>
+              <v:rect w14:anchorId="338A81D1" id="Rectangle 3" o:spid="_x0000_s1026" style="position:absolute;margin-left:265.8pt;margin-top:.95pt;width:43.5pt;height:21pt;z-index:251668480;visibility:visible;mso-wrap-style:square;mso-wrap-distance-left:9pt;mso-wrap-distance-top:0;mso-wrap-distance-right:9pt;mso-wrap-distance-bottom:0;mso-position-horizontal:absolute;mso-position-horizontal-relative:page;mso-position-vertical:absolute;mso-position-vertical-relative:text;v-text-anchor:middle" o:gfxdata="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" fillcolor="white [3201]" strokecolor="black [3200]" strokeweight="1pt">
+                <v:textbox>
+                  <w:txbxContent>
+                    <w:p>
+                      <w:pPr>
+                        <w:jc w:val="center"/>
+                        <w:rPr>
+                          <w:rFonts w:hint="cs"/>
+                          <w:cs/>
+                        </w:rPr>
+                      </w:pPr>
+                      <w:r>
+                        <w:t>/</w:t>
+                      </w:r>
+                    </w:p>
+                  </w:txbxContent>
+                </v:textbox>
+                <w10:wrap anchorx="page"/>
+              </v:rect>
+            </w:pict>
+          </mc:Fallback>
+        </mc:AlternateContent>
       </w:r>
       <w:r>
         <w:rPr>
@@ -476,6 +856,67 @@
           <w:szCs w:val="24"/>
           <w:lang w:val="th-TH"/>
         </w:rPr>
+        <mc:AlternateContent>
+          <mc:Choice Requires="wps">
+            <w:drawing>
+              <wp:anchor distT="0" distB="0" distL="114300" distR="114300" simplePos="0" relativeHeight="251664384" behindDoc="0" locked="0" layoutInCell="1" allowOverlap="1" wp14:anchorId="4F8BF164" wp14:editId="29446E21">
+                <wp:simplePos x="0" y="0"/>
+                <wp:positionH relativeFrom="column">
+                  <wp:posOffset>95250</wp:posOffset>
+                </wp:positionH>
+                <wp:positionV relativeFrom="paragraph">
+                  <wp:posOffset>12065</wp:posOffset>
+                </wp:positionV>
+                <wp:extent cx="552450" cy="266700"/>
+                <wp:effectExtent l="0" t="0" r="19050" b="19050"/>
+                <wp:wrapNone/>
+                <wp:docPr id="1972455526" name="Rectangle 3"/>
+                <wp:cNvGraphicFramePr/>
+                <a:graphic xmlns:a="http://schemas.openxmlformats.org/drawingml/2006/main">
+                  <a:graphicData uri="http://schemas.microsoft.com/office/word/2010/wordprocessingShape">
+                    <wps:wsp>
+                      <wps:cNvSpPr/>
+                      <wps:spPr>
+                        <a:xfrm>
+                          <a:off x="0" y="0"/>
+                          <a:ext cx="552450" cy="266700"/>
+                        </a:xfrm>
+                        <a:prstGeom prst="rect">
+                          <a:avLst/>
+                        </a:prstGeom>
+                      </wps:spPr>
+                      <wps:style>
+                        <a:lnRef idx="2">
+                          <a:schemeClr val="dk1"/>
+                        </a:lnRef>
+                        <a:fillRef idx="1">
+                          <a:schemeClr val="lt1"/>
+                        </a:fillRef>
+                        <a:effectRef idx="0">
+                          <a:schemeClr val="dk1"/>
+                        </a:effectRef>
+                        <a:fontRef idx="minor">
+                          <a:schemeClr val="dk1"/>
+                        </a:fontRef>
+                      </wps:style>
+                      <wps:bodyPr rot="0" spcFirstLastPara="0" vertOverflow="overflow" horzOverflow="overflow" vert="horz" wrap="square" lIns="91440" tIns="45720" rIns="91440" bIns="45720" numCol="1" spcCol="0" rtlCol="0" fromWordArt="0" anchor="ctr" anchorCtr="0" forceAA="0" compatLnSpc="1">
+                        <a:prstTxWarp prst="textNoShape">
+                          <a:avLst/>
+                        </a:prstTxWarp>
+                        <a:noAutofit/>
+                      </wps:bodyPr>
+                    </wps:wsp>
+                  </a:graphicData>
+                </a:graphic>
+              </wp:anchor>
+            </w:drawing>
+          </mc:Choice>
+          <mc:Fallback>
+            <w:pict>
+              <v:rect w14:anchorId="5029927B" id="Rectangle 3" o:spid="_x0000_s1026" style="position:absolute;margin-left:7.5pt;margin-top:.95pt;width:43.5pt;height:21pt;z-index:251664384;visibility:visible;mso-wrap-style:square;mso-wrap-distance-left:9pt;mso-wrap-distance-top:0;mso-wrap-distance-right:9pt;mso-wrap-distance-bottom:0;mso-position-horizontal:absolute;mso-position-horizontal-relative:text;mso-position-vertical:absolute;mso-position-vertical-relative:text;v-text-anchor:middle" o:gfxdata="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" fillcolor="white [3201]" strokecolor="black [3200]" strokeweight="1pt"/>
+            </w:pict>
+          </mc:Fallback>
+        </mc:AlternateContent>
       </w:r>
       <w:r>
         <w:rPr>
@@ -814,6 +1255,75 @@
                 <w:szCs w:val="24"/>
                 <w:lang w:val="th-TH"/>
               </w:rPr>
+              <mc:AlternateContent>
+                <mc:Choice Requires="wps">
+                  <w:drawing>
+                    <wp:anchor distT="0" distB="0" distL="114300" distR="114300" simplePos="0" relativeHeight="251672576" behindDoc="0" locked="0" layoutInCell="1" allowOverlap="1" wp14:anchorId="48CFC28C" wp14:editId="63E16959">
+                      <wp:simplePos x="0" y="0"/>
+                      <wp:positionH relativeFrom="margin">
+                        <wp:posOffset>-25400</wp:posOffset>
+                      </wp:positionH>
+                      <wp:positionV relativeFrom="paragraph">
+                        <wp:posOffset>64770</wp:posOffset>
+                      </wp:positionV>
+                      <wp:extent cx="142875" cy="95250"/>
+                      <wp:effectExtent l="0" t="0" r="28575" b="19050"/>
+                      <wp:wrapNone/>
+                      <wp:docPr id="159183688" name="Rectangle 3"/>
+                      <wp:cNvGraphicFramePr/>
+                      <a:graphic xmlns:a="http://schemas.openxmlformats.org/drawingml/2006/main">
+                        <a:graphicData uri="http://schemas.microsoft.com/office/word/2010/wordprocessingShape">
+                          <wps:wsp>
+                            <wps:cNvSpPr/>
+                            <wps:spPr>
+                              <a:xfrm>
+                                <a:off x="0" y="0"/>
+                                <a:ext cx="142875" cy="95250"/>
+                              </a:xfrm>
+                              <a:prstGeom prst="rect">
+                                <a:avLst/>
+                              </a:prstGeom>
+                            </wps:spPr>
+                            <wps:style>
+                              <a:lnRef idx="2">
+                                <a:schemeClr val="dk1"/>
+                              </a:lnRef>
+                              <a:fillRef idx="1">
+                                <a:schemeClr val="lt1"/>
+                              </a:fillRef>
+                              <a:effectRef idx="0">
+                                <a:schemeClr val="dk1"/>
+                              </a:effectRef>
+                              <a:fontRef idx="minor">
+                                <a:schemeClr val="dk1"/>
+                              </a:fontRef>
+                            </wps:style>
+                            <wps:bodyPr rot="0" spcFirstLastPara="0" vertOverflow="overflow" horzOverflow="overflow" vert="horz" wrap="square" lIns="91440" tIns="45720" rIns="91440" bIns="45720" numCol="1" spcCol="0" rtlCol="0" fromWordArt="0" anchor="ctr" anchorCtr="0" forceAA="0" compatLnSpc="1">
+                              <a:prstTxWarp prst="textNoShape">
+                                <a:avLst/>
+                              </a:prstTxWarp>
+                              <a:noAutofit/>
+                            </wps:bodyPr>
+                          </wps:wsp>
+                        </a:graphicData>
+                      </a:graphic>
+                      <wp14:sizeRelH relativeFrom="margin">
+                        <wp14:pctWidth>0</wp14:pctWidth>
+                      </wp14:sizeRelH>
+                      <wp14:sizeRelV relativeFrom="margin">
+                        <wp14:pctHeight>0</wp14:pctHeight>
+                      </wp14:sizeRelV>
+                    </wp:anchor>
+                  </w:drawing>
+                </mc:Choice>
+                <mc:Fallback>
+                  <w:pict>
+                    <v:rect w14:anchorId="580FB1FF" id="Rectangle 3" o:spid="_x0000_s1026" style="position:absolute;margin-left:-2pt;margin-top:5.1pt;width:11.25pt;height:7.5pt;z-index:251672576;visibility:visible;mso-wrap-style:square;mso-width-percent:0;mso-height-percent:0;mso-wrap-distance-left:9pt;mso-wrap-distance-top:0;mso-wrap-distance-right:9pt;mso-wrap-distance-bottom:0;mso-position-horizontal:absolute;mso-position-horizontal-relative:margin;mso-position-vertical:absolute;mso-position-vertical-relative:text;mso-width-percent:0;mso-height-percent:0;mso-width-relative:margin;mso-height-relative:margin;v-text-anchor:middle" o:gfxdata="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" fillcolor="white [3201]" strokecolor="black [3200]" strokeweight="1pt">
+                      <w10:wrap anchorx="margin"/>
+                    </v:rect>
+                  </w:pict>
+                </mc:Fallback>
+              </mc:AlternateContent>
             </w:r>
             <w:r>
               <w:rPr>
@@ -866,6 +1376,75 @@
                 <w:szCs w:val="24"/>
                 <w:lang w:val="th-TH"/>
               </w:rPr>
+              <mc:AlternateContent>
+                <mc:Choice Requires="wps">
+                  <w:drawing>
+                    <wp:anchor distT="0" distB="0" distL="114300" distR="114300" simplePos="0" relativeHeight="251674624" behindDoc="0" locked="0" layoutInCell="1" allowOverlap="1" wp14:anchorId="7E8BC70C" wp14:editId="135E4F28">
+                      <wp:simplePos x="0" y="0"/>
+                      <wp:positionH relativeFrom="margin">
+                        <wp:posOffset>22225</wp:posOffset>
+                      </wp:positionH>
+                      <wp:positionV relativeFrom="paragraph">
+                        <wp:posOffset>67310</wp:posOffset>
+                      </wp:positionV>
+                      <wp:extent cx="142875" cy="95250"/>
+                      <wp:effectExtent l="0" t="0" r="28575" b="19050"/>
+                      <wp:wrapNone/>
+                      <wp:docPr id="1092500868" name="Rectangle 3"/>
+                      <wp:cNvGraphicFramePr/>
+                      <a:graphic xmlns:a="http://schemas.openxmlformats.org/drawingml/2006/main">
+                        <a:graphicData uri="http://schemas.microsoft.com/office/word/2010/wordprocessingShape">
+                          <wps:wsp>
+                            <wps:cNvSpPr/>
+                            <wps:spPr>
+                              <a:xfrm>
+                                <a:off x="0" y="0"/>
+                                <a:ext cx="142875" cy="95250"/>
+                              </a:xfrm>
+                              <a:prstGeom prst="rect">
+                                <a:avLst/>
+                              </a:prstGeom>
+                            </wps:spPr>
+                            <wps:style>
+                              <a:lnRef idx="2">
+                                <a:schemeClr val="dk1"/>
+                              </a:lnRef>
+                              <a:fillRef idx="1">
+                                <a:schemeClr val="lt1"/>
+                              </a:fillRef>
+                              <a:effectRef idx="0">
+                                <a:schemeClr val="dk1"/>
+                              </a:effectRef>
+                              <a:fontRef idx="minor">
+                                <a:schemeClr val="dk1"/>
+                              </a:fontRef>
+                            </wps:style>
+                            <wps:bodyPr rot="0" spcFirstLastPara="0" vertOverflow="overflow" horzOverflow="overflow" vert="horz" wrap="square" lIns="91440" tIns="45720" rIns="91440" bIns="45720" numCol="1" spcCol="0" rtlCol="0" fromWordArt="0" anchor="ctr" anchorCtr="0" forceAA="0" compatLnSpc="1">
+                              <a:prstTxWarp prst="textNoShape">
+                                <a:avLst/>
+                              </a:prstTxWarp>
+                              <a:noAutofit/>
+                            </wps:bodyPr>
+                          </wps:wsp>
+                        </a:graphicData>
+                      </a:graphic>
+                      <wp14:sizeRelH relativeFrom="margin">
+                        <wp14:pctWidth>0</wp14:pctWidth>
+                      </wp14:sizeRelH>
+                      <wp14:sizeRelV relativeFrom="margin">
+                        <wp14:pctHeight>0</wp14:pctHeight>
+                      </wp14:sizeRelV>
+                    </wp:anchor>
+                  </w:drawing>
+                </mc:Choice>
+                <mc:Fallback>
+                  <w:pict>
+                    <v:rect w14:anchorId="1193B3FD" id="Rectangle 3" o:spid="_x0000_s1026" style="position:absolute;margin-left:1.75pt;margin-top:5.3pt;width:11.25pt;height:7.5pt;z-index:251674624;visibility:visible;mso-wrap-style:square;mso-width-percent:0;mso-height-percent:0;mso-wrap-distance-left:9pt;mso-wrap-distance-top:0;mso-wrap-distance-right:9pt;mso-wrap-distance-bottom:0;mso-position-horizontal:absolute;mso-position-horizontal-relative:margin;mso-position-vertical:absolute;mso-position-vertical-relative:text;mso-width-percent:0;mso-height-percent:0;mso-width-relative:margin;mso-height-relative:margin;v-text-anchor:middle" o:gfxdata="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" fillcolor="white [3201]" strokecolor="black [3200]" strokeweight="1pt">
+                      <w10:wrap anchorx="margin"/>
+                    </v:rect>
+                  </w:pict>
+                </mc:Fallback>
+              </mc:AlternateContent>
             </w:r>
             <w:r>
               <w:rPr>
@@ -918,6 +1497,75 @@
                 <w:szCs w:val="24"/>
                 <w:lang w:val="th-TH"/>
               </w:rPr>
+              <mc:AlternateContent>
+                <mc:Choice Requires="wps">
+                  <w:drawing>
+                    <wp:anchor distT="0" distB="0" distL="114300" distR="114300" simplePos="0" relativeHeight="251676672" behindDoc="0" locked="0" layoutInCell="1" allowOverlap="1" wp14:anchorId="50D28A09" wp14:editId="4A246E80">
+                      <wp:simplePos x="0" y="0"/>
+                      <wp:positionH relativeFrom="margin">
+                        <wp:posOffset>30480</wp:posOffset>
+                      </wp:positionH>
+                      <wp:positionV relativeFrom="paragraph">
+                        <wp:posOffset>62230</wp:posOffset>
+                      </wp:positionV>
+                      <wp:extent cx="142875" cy="95250"/>
+                      <wp:effectExtent l="0" t="0" r="28575" b="19050"/>
+                      <wp:wrapNone/>
+                      <wp:docPr id="2044339036" name="Rectangle 3"/>
+                      <wp:cNvGraphicFramePr/>
+                      <a:graphic xmlns:a="http://schemas.openxmlformats.org/drawingml/2006/main">
+                        <a:graphicData uri="http://schemas.microsoft.com/office/word/2010/wordprocessingShape">
+                          <wps:wsp>
+                            <wps:cNvSpPr/>
+                            <wps:spPr>
+                              <a:xfrm>
+                                <a:off x="0" y="0"/>
+                                <a:ext cx="142875" cy="95250"/>
+                              </a:xfrm>
+                              <a:prstGeom prst="rect">
+                                <a:avLst/>
+                              </a:prstGeom>
+                            </wps:spPr>
+                            <wps:style>
+                              <a:lnRef idx="2">
+                                <a:schemeClr val="dk1"/>
+                              </a:lnRef>
+                              <a:fillRef idx="1">
+                                <a:schemeClr val="lt1"/>
+                              </a:fillRef>
+                              <a:effectRef idx="0">
+                                <a:schemeClr val="dk1"/>
+                              </a:effectRef>
+                              <a:fontRef idx="minor">
+                                <a:schemeClr val="dk1"/>
+                              </a:fontRef>
+                            </wps:style>
+                            <wps:bodyPr rot="0" spcFirstLastPara="0" vertOverflow="overflow" horzOverflow="overflow" vert="horz" wrap="square" lIns="91440" tIns="45720" rIns="91440" bIns="45720" numCol="1" spcCol="0" rtlCol="0" fromWordArt="0" anchor="ctr" anchorCtr="0" forceAA="0" compatLnSpc="1">
+                              <a:prstTxWarp prst="textNoShape">
+                                <a:avLst/>
+                              </a:prstTxWarp>
+                              <a:noAutofit/>
+                            </wps:bodyPr>
+                          </wps:wsp>
+                        </a:graphicData>
+                      </a:graphic>
+                      <wp14:sizeRelH relativeFrom="margin">
+                        <wp14:pctWidth>0</wp14:pctWidth>
+                      </wp14:sizeRelH>
+                      <wp14:sizeRelV relativeFrom="margin">
+                        <wp14:pctHeight>0</wp14:pctHeight>
+                      </wp14:sizeRelV>
+                    </wp:anchor>
+                  </w:drawing>
+                </mc:Choice>
+                <mc:Fallback>
+                  <w:pict>
+                    <v:rect w14:anchorId="7469CEF4" id="Rectangle 3" o:spid="_x0000_s1026" style="position:absolute;margin-left:2.4pt;margin-top:4.9pt;width:11.25pt;height:7.5pt;z-index:251676672;visibility:visible;mso-wrap-style:square;mso-width-percent:0;mso-height-percent:0;mso-wrap-distance-left:9pt;mso-wrap-distance-top:0;mso-wrap-distance-right:9pt;mso-wrap-distance-bottom:0;mso-position-horizontal:absolute;mso-position-horizontal-relative:margin;mso-position-vertical:absolute;mso-position-vertical-relative:text;mso-width-percent:0;mso-height-percent:0;mso-width-relative:margin;mso-height-relative:margin;v-text-anchor:middle" o:gfxdata="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" fillcolor="white [3201]" strokecolor="black [3200]" strokeweight="1pt">
+                      <w10:wrap anchorx="margin"/>
+                    </v:rect>
+                  </w:pict>
+                </mc:Fallback>
+              </mc:AlternateContent>
             </w:r>
             <w:r>
               <w:rPr>
@@ -950,6 +1598,75 @@
           <w:szCs w:val="24"/>
           <w:lang w:val="th-TH"/>
         </w:rPr>
+        <mc:AlternateContent>
+          <mc:Choice Requires="wps">
+            <w:drawing>
+              <wp:anchor distT="0" distB="0" distL="114300" distR="114300" simplePos="0" relativeHeight="251683840" behindDoc="0" locked="0" layoutInCell="1" allowOverlap="1" wp14:anchorId="7436F8BE" wp14:editId="39D9236A">
+                <wp:simplePos x="0" y="0"/>
+                <wp:positionH relativeFrom="page">
+                  <wp:align>center</wp:align>
+                </wp:positionH>
+                <wp:positionV relativeFrom="paragraph">
+                  <wp:posOffset>9525</wp:posOffset>
+                </wp:positionV>
+                <wp:extent cx="409575" cy="180975"/>
+                <wp:effectExtent l="0" t="0" r="28575" b="28575"/>
+                <wp:wrapNone/>
+                <wp:docPr id="953248042" name="Rectangle 3"/>
+                <wp:cNvGraphicFramePr/>
+                <a:graphic xmlns:a="http://schemas.openxmlformats.org/drawingml/2006/main">
+                  <a:graphicData uri="http://schemas.microsoft.com/office/word/2010/wordprocessingShape">
+                    <wps:wsp>
+                      <wps:cNvSpPr/>
+                      <wps:spPr>
+                        <a:xfrm>
+                          <a:off x="0" y="0"/>
+                          <a:ext cx="409575" cy="180975"/>
+                        </a:xfrm>
+                        <a:prstGeom prst="rect">
+                          <a:avLst/>
+                        </a:prstGeom>
+                      </wps:spPr>
+                      <wps:style>
+                        <a:lnRef idx="2">
+                          <a:schemeClr val="dk1"/>
+                        </a:lnRef>
+                        <a:fillRef idx="1">
+                          <a:schemeClr val="lt1"/>
+                        </a:fillRef>
+                        <a:effectRef idx="0">
+                          <a:schemeClr val="dk1"/>
+                        </a:effectRef>
+                        <a:fontRef idx="minor">
+                          <a:schemeClr val="dk1"/>
+                        </a:fontRef>
+                      </wps:style>
+                      <wps:bodyPr rot="0" spcFirstLastPara="0" vertOverflow="overflow" horzOverflow="overflow" vert="horz" wrap="square" lIns="91440" tIns="45720" rIns="91440" bIns="45720" numCol="1" spcCol="0" rtlCol="0" fromWordArt="0" anchor="ctr" anchorCtr="0" forceAA="0" compatLnSpc="1">
+                        <a:prstTxWarp prst="textNoShape">
+                          <a:avLst/>
+                        </a:prstTxWarp>
+                        <a:noAutofit/>
+                      </wps:bodyPr>
+                    </wps:wsp>
+                  </a:graphicData>
+                </a:graphic>
+                <wp14:sizeRelH relativeFrom="margin">
+                  <wp14:pctWidth>0</wp14:pctWidth>
+                </wp14:sizeRelH>
+                <wp14:sizeRelV relativeFrom="margin">
+                  <wp14:pctHeight>0</wp14:pctHeight>
+                </wp14:sizeRelV>
+              </wp:anchor>
+            </w:drawing>
+          </mc:Choice>
+          <mc:Fallback>
+            <w:pict>
+              <v:rect w14:anchorId="14A80CF7" id="Rectangle 3" o:spid="_x0000_s1026" style="position:absolute;margin-left:0;margin-top:.75pt;width:32.25pt;height:14.25pt;z-index:251683840;visibility:visible;mso-wrap-style:square;mso-width-percent:0;mso-height-percent:0;mso-wrap-distance-left:9pt;mso-wrap-distance-top:0;mso-wrap-distance-right:9pt;mso-wrap-distance-bottom:0;mso-position-horizontal:center;mso-position-horizontal-relative:page;mso-position-vertical:absolute;mso-position-vertical-relative:text;mso-width-percent:0;mso-height-percent:0;mso-width-relative:margin;mso-height-relative:margin;v-text-anchor:middle" o:gfxdata="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" fillcolor="white [3201]" strokecolor="black [3200]" strokeweight="1pt">
+                <w10:wrap anchorx="page"/>
+              </v:rect>
+            </w:pict>
+          </mc:Fallback>
+        </mc:AlternateContent>
       </w:r>
       <w:r>
         <w:rPr>
@@ -957,6 +1674,75 @@
           <w:szCs w:val="24"/>
           <w:lang w:val="th-TH"/>
         </w:rPr>
+        <mc:AlternateContent>
+          <mc:Choice Requires="wps">
+            <w:drawing>
+              <wp:anchor distT="0" distB="0" distL="114300" distR="114300" simplePos="0" relativeHeight="251679744" behindDoc="0" locked="0" layoutInCell="1" allowOverlap="1" wp14:anchorId="5BF24D21" wp14:editId="72CF2030">
+                <wp:simplePos x="0" y="0"/>
+                <wp:positionH relativeFrom="margin">
+                  <wp:align>left</wp:align>
+                </wp:positionH>
+                <wp:positionV relativeFrom="paragraph">
+                  <wp:posOffset>6350</wp:posOffset>
+                </wp:positionV>
+                <wp:extent cx="409575" cy="180975"/>
+                <wp:effectExtent l="0" t="0" r="28575" b="28575"/>
+                <wp:wrapNone/>
+                <wp:docPr id="1737023303" name="Rectangle 3"/>
+                <wp:cNvGraphicFramePr/>
+                <a:graphic xmlns:a="http://schemas.openxmlformats.org/drawingml/2006/main">
+                  <a:graphicData uri="http://schemas.microsoft.com/office/word/2010/wordprocessingShape">
+                    <wps:wsp>
+                      <wps:cNvSpPr/>
+                      <wps:spPr>
+                        <a:xfrm>
+                          <a:off x="0" y="0"/>
+                          <a:ext cx="409575" cy="180975"/>
+                        </a:xfrm>
+                        <a:prstGeom prst="rect">
+                          <a:avLst/>
+                        </a:prstGeom>
+                      </wps:spPr>
+                      <wps:style>
+                        <a:lnRef idx="2">
+                          <a:schemeClr val="dk1"/>
+                        </a:lnRef>
+                        <a:fillRef idx="1">
+                          <a:schemeClr val="lt1"/>
+                        </a:fillRef>
+                        <a:effectRef idx="0">
+                          <a:schemeClr val="dk1"/>
+                        </a:effectRef>
+                        <a:fontRef idx="minor">
+                          <a:schemeClr val="dk1"/>
+                        </a:fontRef>
+                      </wps:style>
+                      <wps:bodyPr rot="0" spcFirstLastPara="0" vertOverflow="overflow" horzOverflow="overflow" vert="horz" wrap="square" lIns="91440" tIns="45720" rIns="91440" bIns="45720" numCol="1" spcCol="0" rtlCol="0" fromWordArt="0" anchor="ctr" anchorCtr="0" forceAA="0" compatLnSpc="1">
+                        <a:prstTxWarp prst="textNoShape">
+                          <a:avLst/>
+                        </a:prstTxWarp>
+                        <a:noAutofit/>
+                      </wps:bodyPr>
+                    </wps:wsp>
+                  </a:graphicData>
+                </a:graphic>
+                <wp14:sizeRelH relativeFrom="margin">
+                  <wp14:pctWidth>0</wp14:pctWidth>
+                </wp14:sizeRelH>
+                <wp14:sizeRelV relativeFrom="margin">
+                  <wp14:pctHeight>0</wp14:pctHeight>
+                </wp14:sizeRelV>
+              </wp:anchor>
+            </w:drawing>
+          </mc:Choice>
+          <mc:Fallback>
+            <w:pict>
+              <v:rect w14:anchorId="61F6D369" id="Rectangle 3" o:spid="_x0000_s1026" style="position:absolute;margin-left:0;margin-top:.5pt;width:32.25pt;height:14.25pt;z-index:251679744;visibility:visible;mso-wrap-style:square;mso-width-percent:0;mso-height-percent:0;mso-wrap-distance-left:9pt;mso-wrap-distance-top:0;mso-wrap-distance-right:9pt;mso-wrap-distance-bottom:0;mso-position-horizontal:left;mso-position-horizontal-relative:margin;mso-position-vertical:absolute;mso-position-vertical-relative:text;mso-width-percent:0;mso-height-percent:0;mso-width-relative:margin;mso-height-relative:margin;v-text-anchor:middle" o:gfxdata="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" fillcolor="white [3201]" strokecolor="black [3200]" strokeweight="1pt">
+                <w10:wrap anchorx="margin"/>
+              </v:rect>
+            </w:pict>
+          </mc:Fallback>
+        </mc:AlternateContent>
       </w:r>
       <w:r>
         <w:rPr>
@@ -1054,6 +1840,197 @@
           <w:szCs w:val="24"/>
           <w:lang w:val="th-TH"/>
         </w:rPr>
+        <mc:AlternateContent>
+          <mc:Choice Requires="wps">
+            <w:drawing>
+              <wp:anchor distT="0" distB="0" distL="114300" distR="114300" simplePos="0" relativeHeight="251681792" behindDoc="0" locked="0" layoutInCell="1" allowOverlap="1" wp14:anchorId="06AD0DB5" wp14:editId="24F43044">
+                <wp:simplePos x="0" y="0"/>
+                <wp:positionH relativeFrom="margin">
+                  <wp:posOffset>0</wp:posOffset>
+                </wp:positionH>
+                <wp:positionV relativeFrom="paragraph">
+                  <wp:posOffset>-635</wp:posOffset>
+                </wp:positionV>
+                <wp:extent cx="409575" cy="180975"/>
+                <wp:effectExtent l="0" t="0" r="28575" b="28575"/>
+                <wp:wrapNone/>
+                <wp:docPr id="382009631" name="Rectangle 3"/>
+                <wp:cNvGraphicFramePr/>
+                <a:graphic xmlns:a="http://schemas.openxmlformats.org/drawingml/2006/main">
+                  <a:graphicData uri="http://schemas.microsoft.com/office/word/2010/wordprocessingShape">
+                    <wps:wsp>
+                      <wps:cNvSpPr/>
+                      <wps:spPr>
+                        <a:xfrm>
+                          <a:off x="0" y="0"/>
+                          <a:ext cx="409575" cy="180975"/>
+                        </a:xfrm>
+                        <a:prstGeom prst="rect">
+                          <a:avLst/>
+                        </a:prstGeom>
+                      </wps:spPr>
+                      <wps:style>
+                        <a:lnRef idx="2">
+                          <a:schemeClr val="dk1"/>
+                        </a:lnRef>
+                        <a:fillRef idx="1">
+                          <a:schemeClr val="lt1"/>
+                        </a:fillRef>
+                        <a:effectRef idx="0">
+                          <a:schemeClr val="dk1"/>
+                        </a:effectRef>
+                        <a:fontRef idx="minor">
+                          <a:schemeClr val="dk1"/>
+                        </a:fontRef>
+                      </wps:style>
+                      <wps:txbx>
+                        <w:txbxContent>
+                          <w:p>
+                            <w:pPr>
+                              <w:jc w:val="center"/>
+                              <w:rPr>
+                                <w:rFonts w:hint="cs"/>
+                                <w:szCs w:val="24"/>
+                                <w:cs/>
+                              </w:rPr>
+                            </w:pPr>
+                            <w:r>
+                              <w:rPr>
+                                <w:rFonts w:asciiTheme="minorBidi" w:hAnsiTheme="minorBidi"/>
+                                <w:sz w:val="30"/>
+                              </w:rPr>
+                              <w:t>/</w:t>
+                            </w:r>
+                            <w:r>
+                              <w:rPr>
+                                <w:sz w:val="144"/>
+                                <w:szCs w:val="144"/>
+                              </w:rPr>
+                              <w:t>/</w:t>
+                            </w:r>
+                          </w:p>
+                          <w:p>
+                            <w:pPr>
+                              <w:jc w:val="center"/>
+                              <w:rPr>
+                                <w:rFonts w:hint="cs"/>
+                                <w:cs/>
+                              </w:rPr>
+                            </w:pPr>
+                          </w:p>
+                          <w:p>
+                            <w:pPr>
+                              <w:jc w:val="center"/>
+                              <w:rPr>
+                                <w:rFonts w:hint="cs"/>
+                                <w:sz w:val="48"/>
+                                <w:szCs w:val="48"/>
+                                <w:cs/>
+                              </w:rPr>
+                            </w:pPr>
+                            <w:r>
+                              <w:rPr>
+                                <w:rFonts w:hint="cs"/>
+                                <w:cs/>
+                              </w:rPr>
+                              <w:t>ฝ</w:t>
+                            </w:r>
+                            <w:r>
+                              <w:t>/</w:t>
+                            </w:r>
+                            <w:r>
+                              <w:t>/</w:t>
+                            </w:r>
+                          </w:p>
+                        </w:txbxContent>
+                      </wps:txbx>
+                      <wps:bodyPr rot="0" spcFirstLastPara="0" vertOverflow="overflow" horzOverflow="overflow" vert="horz" wrap="square" lIns="91440" tIns="45720" rIns="91440" bIns="45720" numCol="1" spcCol="0" rtlCol="0" fromWordArt="0" anchor="ctr" anchorCtr="0" forceAA="0" compatLnSpc="1">
+                        <a:prstTxWarp prst="textNoShape">
+                          <a:avLst/>
+                        </a:prstTxWarp>
+                        <a:noAutofit/>
+                      </wps:bodyPr>
+                    </wps:wsp>
+                  </a:graphicData>
+                </a:graphic>
+                <wp14:sizeRelH relativeFrom="margin">
+                  <wp14:pctWidth>0</wp14:pctWidth>
+                </wp14:sizeRelH>
+                <wp14:sizeRelV relativeFrom="margin">
+                  <wp14:pctHeight>0</wp14:pctHeight>
+                </wp14:sizeRelV>
+              </wp:anchor>
+            </w:drawing>
+          </mc:Choice>
+          <mc:Fallback>
+            <w:pict>
+              <v:rect w14:anchorId="06AD0DB5" id="_x0000_s1027" style="position:absolute;margin-left:0;margin-top:-.05pt;width:32.25pt;height:14.25pt;z-index:251681792;visibility:visible;mso-wrap-style:square;mso-width-percent:0;mso-height-percent:0;mso-wrap-distance-left:9pt;mso-wrap-distance-top:0;mso-wrap-distance-right:9pt;mso-wrap-distance-bottom:0;mso-position-horizontal:absolute;mso-position-horizontal-relative:margin;mso-position-vertical:absolute;mso-position-vertical-relative:text;mso-width-percent:0;mso-height-percent:0;mso-width-relative:margin;mso-height-relative:margin;v-text-anchor:middle" o:gfxdata="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" fillcolor="white [3201]" strokecolor="black [3200]" strokeweight="1pt">
+                <v:textbox>
+                  <w:txbxContent>
+                    <w:p>
+                      <w:pPr>
+                        <w:jc w:val="center"/>
+                        <w:rPr>
+                          <w:rFonts w:hint="cs"/>
+                          <w:szCs w:val="24"/>
+                          <w:cs/>
+                        </w:rPr>
+                      </w:pPr>
+                      <w:r>
+                        <w:rPr>
+                          <w:rFonts w:asciiTheme="minorBidi" w:hAnsiTheme="minorBidi"/>
+                          <w:sz w:val="30"/>
+                        </w:rPr>
+                        <w:t>/</w:t>
+                      </w:r>
+                      <w:r>
+                        <w:rPr>
+                          <w:sz w:val="144"/>
+                          <w:szCs w:val="144"/>
+                        </w:rPr>
+                        <w:t>/</w:t>
+                      </w:r>
+                    </w:p>
+                    <w:p>
+                      <w:pPr>
+                        <w:jc w:val="center"/>
+                        <w:rPr>
+                          <w:rFonts w:hint="cs"/>
+                          <w:cs/>
+                        </w:rPr>
+                      </w:pPr>
+                    </w:p>
+                    <w:p>
+                      <w:pPr>
+                        <w:jc w:val="center"/>
+                        <w:rPr>
+                          <w:rFonts w:hint="cs"/>
+                          <w:sz w:val="48"/>
+                          <w:szCs w:val="48"/>
+                          <w:cs/>
+                        </w:rPr>
+                      </w:pPr>
+                      <w:r>
+                        <w:rPr>
+                          <w:rFonts w:hint="cs"/>
+                          <w:cs/>
+                        </w:rPr>
+                        <w:t>ฝ</w:t>
+                      </w:r>
+                      <w:r>
+                        <w:t>/</w:t>
+                      </w:r>
+                      <w:r>
+                        <w:t>/</w:t>
+                      </w:r>
+                    </w:p>
+                  </w:txbxContent>
+                </v:textbox>
+                <w10:wrap anchorx="margin"/>
+              </v:rect>
+            </w:pict>
+          </mc:Fallback>
+        </mc:AlternateContent>
       </w:r>
       <w:r>
         <w:rPr>
@@ -1260,6 +2237,306 @@
           <w:sz w:val="28"/>
           <w:szCs w:val="28"/>
         </w:rPr>
+        <mc:AlternateContent>
+          <mc:Choice Requires="wps">
+            <w:drawing>
+              <wp:anchor distT="0" distB="0" distL="114300" distR="114300" simplePos="0" relativeHeight="251677696" behindDoc="0" locked="0" layoutInCell="1" allowOverlap="1" wp14:anchorId="74AB7B8E" wp14:editId="074BDFB3">
+                <wp:simplePos x="0" y="0"/>
+                <wp:positionH relativeFrom="margin">
+                  <wp:align>left</wp:align>
+                </wp:positionH>
+                <wp:positionV relativeFrom="paragraph">
+                  <wp:posOffset>84455</wp:posOffset>
+                </wp:positionV>
+                <wp:extent cx="3000375" cy="1314450"/>
+                <wp:effectExtent l="0" t="0" r="28575" b="19050"/>
+                <wp:wrapNone/>
+                <wp:docPr id="1220694552" name="Rectangle 4"/>
+                <wp:cNvGraphicFramePr/>
+                <a:graphic xmlns:a="http://schemas.openxmlformats.org/drawingml/2006/main">
+                  <a:graphicData uri="http://schemas.microsoft.com/office/word/2010/wordprocessingShape">
+                    <wps:wsp>
+                      <wps:cNvSpPr/>
+                      <wps:spPr>
+                        <a:xfrm>
+                          <a:off x="0" y="0"/>
+                          <a:ext cx="3000375" cy="1314450"/>
+                        </a:xfrm>
+                        <a:prstGeom prst="rect">
+                          <a:avLst/>
+                        </a:prstGeom>
+                      </wps:spPr>
+                      <wps:style>
+                        <a:lnRef idx="2">
+                          <a:schemeClr val="dk1"/>
+                        </a:lnRef>
+                        <a:fillRef idx="1">
+                          <a:schemeClr val="lt1"/>
+                        </a:fillRef>
+                        <a:effectRef idx="0">
+                          <a:schemeClr val="dk1"/>
+                        </a:effectRef>
+                        <a:fontRef idx="minor">
+                          <a:schemeClr val="dk1"/>
+                        </a:fontRef>
+                      </wps:style>
+                      <wps:txbx>
+                        <w:txbxContent>
+                          <w:p>
+                            <w:pPr>
+                              <w:jc w:val="center"/>
+                              <w:rPr>
+                                <w:b/>
+                                <w:bCs/>
+                              </w:rPr>
+                            </w:pPr>
+                            <w:r>
+                              <w:rPr>
+                                <w:rFonts w:hint="cs"/>
+                                <w:b/>
+                                <w:bCs/>
+                                <w:cs/>
+                              </w:rPr>
+                              <w:t>ส่วนนี้สำหรับ บมจ.มีนาทรานสปอร์ต</w:t>
+                            </w:r>
+                          </w:p>
+                          <w:p>
+                            <w:pPr>
+                              <w:rPr>
+                                <w:szCs w:val="24"/>
+                              </w:rPr>
+                            </w:pPr>
+                            <w:r>
+                              <w:rPr>
+                                <w:rFonts w:hint="cs"/>
+                                <w:szCs w:val="24"/>
+                                <w:cs/>
+                              </w:rPr>
+                              <w:t>ผู้ขอเปิด..........................ฝ่าย.....................</w:t>
+                            </w:r>
+                            <w:r>
+                              <w:rPr>
+                                <w:rFonts w:hint="cs"/>
+                                <w:szCs w:val="24"/>
+                                <w:cs/>
+                              </w:rPr>
+                              <w:t>...............................</w:t>
+                            </w:r>
+                          </w:p>
+                          <w:p>
+                            <w:pPr>
+                              <w:rPr>
+                                <w:szCs w:val="24"/>
+                              </w:rPr>
+                            </w:pPr>
+                            <w:r>
+                              <w:rPr>
+                                <w:rFonts w:hint="cs"/>
+                                <w:szCs w:val="24"/>
+                                <w:cs/>
+                              </w:rPr>
+                              <w:t>ผู้อนุมัติ (ผู้จัดการฝ่าย).........................วันที่.........</w:t>
+                            </w:r>
+                            <w:r>
+                              <w:rPr>
+                                <w:rFonts w:hint="cs"/>
+                                <w:szCs w:val="24"/>
+                                <w:cs/>
+                              </w:rPr>
+                              <w:t>.............</w:t>
+                            </w:r>
+                            <w:r>
+                              <w:rPr>
+                                <w:rFonts w:hint="cs"/>
+                                <w:szCs w:val="24"/>
+                                <w:cs/>
+                              </w:rPr>
+                              <w:t>..</w:t>
+                            </w:r>
+                            <w:r>
+                              <w:rPr>
+                                <w:rFonts w:hint="cs"/>
+                                <w:szCs w:val="24"/>
+                                <w:cs/>
+                              </w:rPr>
+                              <w:t>.......</w:t>
+                            </w:r>
+                            <w:r>
+                              <w:rPr>
+                                <w:rFonts w:hint="cs"/>
+                                <w:szCs w:val="24"/>
+                                <w:cs/>
+                              </w:rPr>
+                              <w:t>.</w:t>
+                            </w:r>
+                          </w:p>
+                          <w:p>
+                            <w:pPr>
+                              <w:rPr>
+                                <w:rFonts w:hint="cs"/>
+                                <w:szCs w:val="24"/>
+                                <w:cs/>
+                              </w:rPr>
+                            </w:pPr>
+                            <w:r>
+                              <w:rPr>
+                                <w:rFonts w:hint="cs"/>
+                                <w:szCs w:val="24"/>
+                                <w:cs/>
+                              </w:rPr>
+                              <w:t>บัญชีบันทึก................................. ผู้ตรวจทาน..............................</w:t>
+                            </w:r>
+                          </w:p>
+                          <w:p>
+                            <w:pPr>
+                              <w:rPr>
+                                <w:rFonts w:hint="cs"/>
+                                <w:cs/>
+                              </w:rPr>
+                            </w:pPr>
+                          </w:p>
+                        </w:txbxContent>
+                      </wps:txbx>
+                      <wps:bodyPr rot="0" spcFirstLastPara="0" vertOverflow="overflow" horzOverflow="overflow" vert="horz" wrap="square" lIns="91440" tIns="45720" rIns="91440" bIns="45720" numCol="1" spcCol="0" rtlCol="0" fromWordArt="0" anchor="ctr" anchorCtr="0" forceAA="0" compatLnSpc="1">
+                        <a:prstTxWarp prst="textNoShape">
+                          <a:avLst/>
+                        </a:prstTxWarp>
+                        <a:noAutofit/>
+                      </wps:bodyPr>
+                    </wps:wsp>
+                  </a:graphicData>
+                </a:graphic>
+                <wp14:sizeRelV relativeFrom="margin">
+                  <wp14:pctHeight>0</wp14:pctHeight>
+                </wp14:sizeRelV>
+              </wp:anchor>
+            </w:drawing>
+          </mc:Choice>
+          <mc:Fallback>
+            <w:pict>
+              <v:rect w14:anchorId="74AB7B8E" id="Rectangle 4" o:spid="_x0000_s1028" style="position:absolute;left:0;text-align:left;margin-left:0;margin-top:6.65pt;width:236.25pt;height:103.5pt;z-index:251677696;visibility:visible;mso-wrap-style:square;mso-height-percent:0;mso-wrap-distance-left:9pt;mso-wrap-distance-top:0;mso-wrap-distance-right:9pt;mso-wrap-distance-bottom:0;mso-position-horizontal:left;mso-position-horizontal-relative:margin;mso-position-vertical:absolute;mso-position-vertical-relative:text;mso-height-percent:0;mso-height-relative:margin;v-text-anchor:middle" o:gfxdata="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" fillcolor="white [3201]" strokecolor="black [3200]" strokeweight="1pt">
+                <v:textbox>
+                  <w:txbxContent>
+                    <w:p>
+                      <w:pPr>
+                        <w:jc w:val="center"/>
+                        <w:rPr>
+                          <w:b/>
+                          <w:bCs/>
+                        </w:rPr>
+                      </w:pPr>
+                      <w:r>
+                        <w:rPr>
+                          <w:rFonts w:hint="cs"/>
+                          <w:b/>
+                          <w:bCs/>
+                          <w:cs/>
+                        </w:rPr>
+                        <w:t>ส่วนนี้สำหรับ บมจ.มีนาทรานสปอร์ต</w:t>
+                      </w:r>
+                    </w:p>
+                    <w:p>
+                      <w:pPr>
+                        <w:rPr>
+                          <w:szCs w:val="24"/>
+                        </w:rPr>
+                      </w:pPr>
+                      <w:r>
+                        <w:rPr>
+                          <w:rFonts w:hint="cs"/>
+                          <w:szCs w:val="24"/>
+                          <w:cs/>
+                        </w:rPr>
+                        <w:t>ผู้ขอเปิด..........................ฝ่าย.....................</w:t>
+                      </w:r>
+                      <w:r>
+                        <w:rPr>
+                          <w:rFonts w:hint="cs"/>
+                          <w:szCs w:val="24"/>
+                          <w:cs/>
+                        </w:rPr>
+                        <w:t>...............................</w:t>
+                      </w:r>
+                    </w:p>
+                    <w:p>
+                      <w:pPr>
+                        <w:rPr>
+                          <w:szCs w:val="24"/>
+                        </w:rPr>
+                      </w:pPr>
+                      <w:r>
+                        <w:rPr>
+                          <w:rFonts w:hint="cs"/>
+                          <w:szCs w:val="24"/>
+                          <w:cs/>
+                        </w:rPr>
+                        <w:t>ผู้อนุมัติ (ผู้จัดการฝ่าย).........................วันที่.........</w:t>
+                      </w:r>
+                      <w:r>
+                        <w:rPr>
+                          <w:rFonts w:hint="cs"/>
+                          <w:szCs w:val="24"/>
+                          <w:cs/>
+                        </w:rPr>
+                        <w:t>.............</w:t>
+                      </w:r>
+                      <w:r>
+                        <w:rPr>
+                          <w:rFonts w:hint="cs"/>
+                          <w:szCs w:val="24"/>
+                          <w:cs/>
+                        </w:rPr>
+                        <w:t>..</w:t>
+                      </w:r>
+                      <w:r>
+                        <w:rPr>
+                          <w:rFonts w:hint="cs"/>
+                          <w:szCs w:val="24"/>
+                          <w:cs/>
+                        </w:rPr>
+                        <w:t>.......</w:t>
+                      </w:r>
+                      <w:r>
+                        <w:rPr>
+                          <w:rFonts w:hint="cs"/>
+                          <w:szCs w:val="24"/>
+                          <w:cs/>
+                        </w:rPr>
+                        <w:t>.</w:t>
+                      </w:r>
+                    </w:p>
+                    <w:p>
+                      <w:pPr>
+                        <w:rPr>
+                          <w:rFonts w:hint="cs"/>
+                          <w:szCs w:val="24"/>
+                          <w:cs/>
+                        </w:rPr>
+                      </w:pPr>
+                      <w:r>
+                        <w:rPr>
+                          <w:rFonts w:hint="cs"/>
+                          <w:szCs w:val="24"/>
+                          <w:cs/>
+                        </w:rPr>
+                        <w:t>บัญชีบันทึก................................. ผู้ตรวจทาน..............................</w:t>
+                      </w:r>
+                    </w:p>
+                    <w:p>
+                      <w:pPr>
+                        <w:rPr>
+                          <w:rFonts w:hint="cs"/>
+                          <w:cs/>
+                        </w:rPr>
+                      </w:pPr>
+                    </w:p>
+                  </w:txbxContent>
+                </v:textbox>
+                <w10:wrap anchorx="margin"/>
+              </v:rect>
+            </w:pict>
+          </mc:Fallback>
+        </mc:AlternateContent>
       </w:r>
       <w:r>
         <w:rPr>

</xml_diff>